<commit_message>
Add access, close and appendix sections; dedupe sources; compact reference pages; v2 docs
Co-Authored-By: Claude Fable 5.1 <noreply@anthropic.com>
Claude-Session: https://claude.ai/code/session_01JSgzstiAATrmUAETyfZs6d
</commit_message>
<xml_diff>
--- a/docs/Decision_Checklist_Handout.docx
+++ b/docs/Decision_Checklist_Handout.docx
@@ -169,7 +169,7 @@
           </w:tcPr>
           <w:p>
             <w:r>
-              <w:t>Is the need validated with patients and clinicians? Is the need statement solution-neutral?</w:t>
+              <w:t>Is the need validated with patients and clinicians? Is the need statement solution-neutral? Is the intended purpose medical (so it is a device)?</w:t>
             </w:r>
           </w:p>
         </w:tc>
@@ -179,7 +179,7 @@
           </w:tcPr>
           <w:p>
             <w:r>
-              <w:t>Need statement; observation notes</w:t>
+              <w:t>Need statement; observation notes; intended-use statement</w:t>
             </w:r>
           </w:p>
         </w:tc>
@@ -307,7 +307,7 @@
           </w:tcPr>
           <w:p>
             <w:r>
-              <w:t>Is consent independent of any dependent relationship, in the person’s language? Are conflicts disclosed and managed?</w:t>
+              <w:t>Is consent independent of any dependent relationship, in the person’s language? Are conflicts disclosed and managed? Ethics committee registered; CTRI entry before enrolment</w:t>
             </w:r>
           </w:p>
         </w:tc>
@@ -317,7 +317,7 @@
           </w:tcPr>
           <w:p>
             <w:r>
-              <w:t>Consent form and process; COI management plan; CTRI entry</w:t>
+              <w:t>Consent form and process; COI management plan; EC approval; CTRI entry</w:t>
             </w:r>
           </w:p>
         </w:tc>
@@ -376,7 +376,7 @@
           </w:tcPr>
           <w:p>
             <w:r>
-              <w:t>Which CDSCO permission covers this use: test licence (MD-13), clinical investigation (MD-23), manufacturing licence?</w:t>
+              <w:t>Risk class (A–D)? Test licence MD-13; clinical investigation MD-23; manufacturing licence MD-5 (State, A/B) or MD-9 (Central, C/D); import MD-15; Class A non-sterile non-measuring registration</w:t>
             </w:r>
           </w:p>
         </w:tc>
@@ -386,7 +386,7 @@
           </w:tcPr>
           <w:p>
             <w:r>
-              <w:t>Class; licence or permission; registered ethics committee approval</w:t>
+              <w:t>Classification rationale; licence or permission; QMS (Fifth Schedule); essential-principles checklist</w:t>
             </w:r>
           </w:p>
         </w:tc>
@@ -445,7 +445,7 @@
           </w:tcPr>
           <w:p>
             <w:r>
-              <w:t>What is the total cost of use? Who is excluded by its demands (vision, dexterity, language, power, phone)? Do marketing claims match the evidence?</w:t>
+              <w:t>What is the total cost of use? Who is excluded by its demands (vision, dexterity, language, power, phone)? Do marketing claims match the evidence (UCMPMD, DMRA)?</w:t>
             </w:r>
           </w:p>
         </w:tc>
@@ -514,7 +514,7 @@
           </w:tcPr>
           <w:p>
             <w:r>
-              <w:t>Who records, reports (MvPI) and acts on harm? How are updates validated, released and rolled back?</w:t>
+              <w:t>Who records, reports (MvPI) and acts on harm? PSUR schedule? How are updates validated, released and rolled back?</w:t>
             </w:r>
           </w:p>
         </w:tc>
@@ -524,7 +524,7 @@
           </w:tcPr>
           <w:p>
             <w:r>
-              <w:t>Complaint log; MvPI route; change-control and rollback plan</w:t>
+              <w:t>Complaint log; MvPI route; PSUR calendar; change-control and rollback plan</w:t>
             </w:r>
           </w:p>
         </w:tc>
@@ -570,7 +570,7 @@
         <w:t xml:space="preserve">Label every claim: </w:t>
       </w:r>
       <w:r>
-        <w:t>Demonstrated · Reported, preliminary · Planned · Not established.   India anchors: MDR-2017 (MD-13; MD-22/23; MD-5/MD-9) · ethics committee registered with CDSCO · CTRI · ICMR 2017 · MvPI 1800-180-3024 · UCMPMD 2024 · DPDP Rules 2025.</w:t>
+        <w:t>Demonstrated · Reported, preliminary · Planned · Not established.   India anchors: MDR-2017 (Class A–D; MD-13; MD-22/23; MD-5 State / MD-9 Central; MD-15 import) · ethics committee registered with CDSCO · CTRI · ICMR 2017 · MvPI 1800-180-3024 · UCMPMD 2024 · DPDP Rules 2025.</w:t>
       </w:r>
     </w:p>
     <w:p>

</xml_diff>